<commit_message>
Update rate sheet and rental agreement: non-refundable cleaning fee + refundable security deposit
</commit_message>
<xml_diff>
--- a/docs/Great-Hall-Event-Rental-Agreement.docx
+++ b/docs/Great-Hall-Event-Rental-Agreement.docx
@@ -1612,7 +1612,7 @@
                 <w:sz w:val="19"/>
                 <w:szCs w:val="19"/>
               </w:rPr>
-              <w:t xml:space="preserve">Cleaning</w:t>
+              <w:t xml:space="preserve">Cleaning &amp; deposit</w:t>
             </w:r>
           </w:p>
         </w:tc>
@@ -1730,7 +1730,7 @@
                 <w:sz w:val="20"/>
                 <w:szCs w:val="20"/>
               </w:rPr>
-              <w:t xml:space="preserve">Cleaning deposit — refundable</w:t>
+              <w:t xml:space="preserve">Cleaning fee — non-refundable</w:t>
             </w:r>
           </w:p>
         </w:tc>
@@ -1807,6 +1807,122 @@
                 <w:szCs w:val="20"/>
               </w:rPr>
               <w:t xml:space="preserve">$250</w:t>
+            </w:r>
+          </w:p>
+        </w:tc>
+      </w:tr>
+      <w:tr>
+        <w:tc>
+          <w:tcPr>
+            <w:tcW w:type="dxa" w:w="4680"/>
+            <w:tcBorders>
+              <w:top w:val="single" w:color="DEE2E6" w:sz="2"/>
+              <w:left w:val="none" w:color="FFFFFF" w:sz="0"/>
+              <w:bottom w:val="single" w:color="DEE2E6" w:sz="2"/>
+              <w:right w:val="none" w:color="FFFFFF" w:sz="0"/>
+            </w:tcBorders>
+            <w:tcMar>
+              <w:top w:type="dxa" w:w="70"/>
+              <w:left w:type="dxa" w:w="110"/>
+              <w:bottom w:type="dxa" w:w="70"/>
+              <w:right w:type="dxa" w:w="110"/>
+            </w:tcMar>
+            <w:vAlign w:val="center"/>
+          </w:tcPr>
+          <w:p>
+            <w:pPr>
+              <w:spacing w:after="0" w:before="0" w:line="264"/>
+              <w:jc w:val="left"/>
+            </w:pPr>
+            <w:r>
+              <w:rPr>
+                <w:rFonts w:ascii="Calibri" w:cs="Calibri" w:eastAsia="Calibri" w:hAnsi="Calibri"/>
+                <w:b/>
+                <w:bCs/>
+                <w:i w:val="false"/>
+                <w:iCs w:val="false"/>
+                <w:caps w:val="false"/>
+                <w:color w:val="212529"/>
+                <w:sz w:val="20"/>
+                <w:szCs w:val="20"/>
+              </w:rPr>
+              <w:t xml:space="preserve">Security deposit — refundable</w:t>
+            </w:r>
+          </w:p>
+        </w:tc>
+        <w:tc>
+          <w:tcPr>
+            <w:tcW w:type="dxa" w:w="2700"/>
+            <w:tcBorders>
+              <w:top w:val="single" w:color="DEE2E6" w:sz="2"/>
+              <w:left w:val="none" w:color="FFFFFF" w:sz="0"/>
+              <w:bottom w:val="single" w:color="DEE2E6" w:sz="2"/>
+              <w:right w:val="none" w:color="FFFFFF" w:sz="0"/>
+            </w:tcBorders>
+            <w:tcMar>
+              <w:top w:type="dxa" w:w="70"/>
+              <w:left w:type="dxa" w:w="110"/>
+              <w:bottom w:type="dxa" w:w="70"/>
+              <w:right w:type="dxa" w:w="110"/>
+            </w:tcMar>
+            <w:vAlign w:val="center"/>
+          </w:tcPr>
+          <w:p>
+            <w:pPr>
+              <w:spacing w:after="0" w:before="0" w:line="264"/>
+              <w:jc w:val="center"/>
+            </w:pPr>
+            <w:r>
+              <w:rPr>
+                <w:rFonts w:ascii="Calibri" w:cs="Calibri" w:eastAsia="Calibri" w:hAnsi="Calibri"/>
+                <w:b/>
+                <w:bCs/>
+                <w:i w:val="false"/>
+                <w:iCs w:val="false"/>
+                <w:caps w:val="false"/>
+                <w:color w:val="212529"/>
+                <w:sz w:val="20"/>
+                <w:szCs w:val="20"/>
+              </w:rPr>
+              <w:t xml:space="preserve">$500</w:t>
+            </w:r>
+          </w:p>
+        </w:tc>
+        <w:tc>
+          <w:tcPr>
+            <w:tcW w:type="dxa" w:w="2700"/>
+            <w:tcBorders>
+              <w:top w:val="single" w:color="DEE2E6" w:sz="2"/>
+              <w:left w:val="none" w:color="FFFFFF" w:sz="0"/>
+              <w:bottom w:val="single" w:color="DEE2E6" w:sz="2"/>
+              <w:right w:val="none" w:color="FFFFFF" w:sz="0"/>
+            </w:tcBorders>
+            <w:tcMar>
+              <w:top w:type="dxa" w:w="70"/>
+              <w:left w:type="dxa" w:w="110"/>
+              <w:bottom w:type="dxa" w:w="70"/>
+              <w:right w:type="dxa" w:w="110"/>
+            </w:tcMar>
+            <w:vAlign w:val="center"/>
+          </w:tcPr>
+          <w:p>
+            <w:pPr>
+              <w:spacing w:after="0" w:before="0" w:line="264"/>
+              <w:jc w:val="center"/>
+            </w:pPr>
+            <w:r>
+              <w:rPr>
+                <w:rFonts w:ascii="Calibri" w:cs="Calibri" w:eastAsia="Calibri" w:hAnsi="Calibri"/>
+                <w:b/>
+                <w:bCs/>
+                <w:i w:val="false"/>
+                <w:iCs w:val="false"/>
+                <w:caps w:val="false"/>
+                <w:color w:val="212529"/>
+                <w:sz w:val="20"/>
+                <w:szCs w:val="20"/>
+              </w:rPr>
+              <w:t xml:space="preserve">$500</w:t>
             </w:r>
           </w:p>
         </w:tc>
@@ -3169,7 +3285,7 @@
                 <w:sz w:val="20"/>
                 <w:szCs w:val="20"/>
               </w:rPr>
-              <w:t xml:space="preserve">Cleaning deposit (refundable)</w:t>
+              <w:t xml:space="preserve">Cleaning fee (non-refundable)</w:t>
             </w:r>
           </w:p>
         </w:tc>
@@ -3244,6 +3360,119 @@
                 <w:szCs w:val="20"/>
               </w:rPr>
               <w:t xml:space="preserve">$250.00</w:t>
+            </w:r>
+          </w:p>
+        </w:tc>
+      </w:tr>
+      <w:tr>
+        <w:tc>
+          <w:tcPr>
+            <w:tcW w:type="dxa" w:w="6480"/>
+            <w:tcBorders>
+              <w:top w:val="single" w:color="DEE2E6" w:sz="2"/>
+              <w:left w:val="none" w:color="FFFFFF" w:sz="0"/>
+              <w:bottom w:val="single" w:color="DEE2E6" w:sz="2"/>
+              <w:right w:val="none" w:color="FFFFFF" w:sz="0"/>
+            </w:tcBorders>
+            <w:tcMar>
+              <w:top w:type="dxa" w:w="70"/>
+              <w:left w:type="dxa" w:w="110"/>
+              <w:bottom w:type="dxa" w:w="70"/>
+              <w:right w:type="dxa" w:w="110"/>
+            </w:tcMar>
+          </w:tcPr>
+          <w:p>
+            <w:pPr>
+              <w:spacing w:after="0" w:before="0" w:line="264"/>
+              <w:jc w:val="left"/>
+            </w:pPr>
+            <w:r>
+              <w:rPr>
+                <w:rFonts w:ascii="Calibri" w:cs="Calibri" w:eastAsia="Calibri" w:hAnsi="Calibri"/>
+                <w:b/>
+                <w:bCs/>
+                <w:i w:val="false"/>
+                <w:iCs w:val="false"/>
+                <w:caps w:val="false"/>
+                <w:color w:val="212529"/>
+                <w:sz w:val="20"/>
+                <w:szCs w:val="20"/>
+              </w:rPr>
+              <w:t xml:space="preserve">Security deposit (refundable)</w:t>
+            </w:r>
+          </w:p>
+        </w:tc>
+        <w:tc>
+          <w:tcPr>
+            <w:tcW w:type="dxa" w:w="1800"/>
+            <w:tcBorders>
+              <w:top w:val="single" w:color="DEE2E6" w:sz="2"/>
+              <w:left w:val="none" w:color="FFFFFF" w:sz="0"/>
+              <w:bottom w:val="single" w:color="DEE2E6" w:sz="2"/>
+              <w:right w:val="none" w:color="FFFFFF" w:sz="0"/>
+            </w:tcBorders>
+            <w:tcMar>
+              <w:top w:type="dxa" w:w="70"/>
+              <w:left w:type="dxa" w:w="110"/>
+              <w:bottom w:type="dxa" w:w="70"/>
+              <w:right w:type="dxa" w:w="110"/>
+            </w:tcMar>
+          </w:tcPr>
+          <w:p>
+            <w:pPr>
+              <w:spacing w:after="0" w:before="0" w:line="264"/>
+              <w:jc w:val="center"/>
+            </w:pPr>
+            <w:r>
+              <w:rPr>
+                <w:rFonts w:ascii="Calibri" w:cs="Calibri" w:eastAsia="Calibri" w:hAnsi="Calibri"/>
+                <w:b/>
+                <w:bCs/>
+                <w:i w:val="false"/>
+                <w:iCs w:val="false"/>
+                <w:caps w:val="false"/>
+                <w:color w:val="212529"/>
+                <w:sz w:val="20"/>
+                <w:szCs w:val="20"/>
+              </w:rPr>
+              <w:t xml:space="preserve"/>
+            </w:r>
+          </w:p>
+        </w:tc>
+        <w:tc>
+          <w:tcPr>
+            <w:tcW w:type="dxa" w:w="1800"/>
+            <w:tcBorders>
+              <w:top w:val="single" w:color="DEE2E6" w:sz="2"/>
+              <w:left w:val="none" w:color="FFFFFF" w:sz="0"/>
+              <w:bottom w:val="single" w:color="DEE2E6" w:sz="2"/>
+              <w:right w:val="none" w:color="FFFFFF" w:sz="0"/>
+            </w:tcBorders>
+            <w:tcMar>
+              <w:top w:type="dxa" w:w="70"/>
+              <w:left w:type="dxa" w:w="110"/>
+              <w:bottom w:type="dxa" w:w="70"/>
+              <w:right w:type="dxa" w:w="110"/>
+            </w:tcMar>
+          </w:tcPr>
+          <w:p>
+            <w:pPr>
+              <w:spacing w:after="0" w:before="0" w:line="264"/>
+              <w:jc w:val="center"/>
+            </w:pPr>
+            <w:r>
+              <w:rPr>
+                <w:rFonts w:ascii="Calibri" w:cs="Calibri" w:eastAsia="Calibri" w:hAnsi="Calibri"/>
+                <w:b/>
+                <w:bCs/>
+                <w:i w:val="false"/>
+                <w:iCs w:val="false"/>
+                <w:caps w:val="false"/>
+                <w:color w:val="212529"/>
+                <w:sz w:val="20"/>
+                <w:szCs w:val="20"/>
+              </w:rPr>
+              <w:t xml:space="preserve">$500.00</w:t>
             </w:r>
           </w:p>
         </w:tc>
@@ -3665,7 +3894,7 @@
           <w:sz w:val="20"/>
           <w:szCs w:val="20"/>
         </w:rPr>
-        <w:t xml:space="preserve"> and the cleaning deposit are due 7 days before the event.</w:t>
+        <w:t xml:space="preserve">, the cleaning fee, and the security deposit are due 7 days before the event.</w:t>
       </w:r>
     </w:p>
     <w:p>
@@ -3719,7 +3948,7 @@
           <w:sz w:val="21"/>
           <w:szCs w:val="21"/>
         </w:rPr>
-        <w:t xml:space="preserve">6. Cleaning deposit</w:t>
+        <w:t xml:space="preserve">6. Cleaning fee and security deposit</w:t>
       </w:r>
     </w:p>
     <w:p>
@@ -3739,25 +3968,7 @@
           <w:sz w:val="20"/>
           <w:szCs w:val="20"/>
         </w:rPr>
-        <w:t xml:space="preserve">The $250 cleaning charge is collected as a refundable deposit, not a fee. Owner returns it in full within 10 business days after the event if Renter leaves the Premises in the condition required by Section 9. If Renter does not, Owner will deduct the actual cost of cleaning, waste removal, or repair and return the balance with a written itemization. If those costs exceed $250, Renter pays the difference within 15 days of invoice.</w:t>
-      </w:r>
-    </w:p>
-    <w:p>
-      <w:pPr>
-        <w:spacing w:after="100" w:before="260"/>
-      </w:pPr>
-      <w:r>
-        <w:rPr>
-          <w:rFonts w:ascii="Calibri" w:cs="Calibri" w:eastAsia="Calibri" w:hAnsi="Calibri"/>
-          <w:b/>
-          <w:bCs/>
-          <w:caps/>
-          <w:color w:val="1B2A3D"/>
-          <w:spacing w:val="8"/>
-          <w:sz w:val="21"/>
-          <w:szCs w:val="21"/>
-        </w:rPr>
-        <w:t xml:space="preserve">7. Cancellation and rescheduling</w:t>
+        <w:t xml:space="preserve">These are two separate charges and they work differently.</w:t>
       </w:r>
     </w:p>
     <w:p>
@@ -3777,7 +3988,7 @@
           <w:sz w:val="20"/>
           <w:szCs w:val="20"/>
         </w:rPr>
-        <w:t xml:space="preserve">More than 30 days before the event: </w:t>
+        <w:t xml:space="preserve">The cleaning fee </w:t>
       </w:r>
       <w:r>
         <w:rPr>
@@ -3785,7 +3996,7 @@
           <w:sz w:val="20"/>
           <w:szCs w:val="20"/>
         </w:rPr>
-        <w:t xml:space="preserve">full refund of amounts paid, less a $100 administrative fee.</w:t>
+        <w:t xml:space="preserve">of $250 is not refundable. It covers Owner’s routine turn of the Premises after a normal event — vacuuming and mopping, restroom service, and removal of bagged trash Renter has collected. It does not relieve Renter of the obligations in Section 9.</w:t>
       </w:r>
     </w:p>
     <w:p>
@@ -3805,7 +4016,7 @@
           <w:sz w:val="20"/>
           <w:szCs w:val="20"/>
         </w:rPr>
-        <w:t xml:space="preserve">15–30 days before the event: </w:t>
+        <w:t xml:space="preserve">The security deposit </w:t>
       </w:r>
       <w:r>
         <w:rPr>
@@ -3813,112 +4024,12 @@
           <w:sz w:val="20"/>
           <w:szCs w:val="20"/>
         </w:rPr>
-        <w:t xml:space="preserve">Owner retains 50% of the space rental.</w:t>
-      </w:r>
-    </w:p>
-    <w:p>
-      <w:pPr>
-        <w:pStyle w:val="ListParagraph"/>
-        <w:numPr>
-          <w:ilvl w:val="0"/>
-          <w:numId w:val="1"/>
-        </w:numPr>
-        <w:spacing w:after="80" w:line="264"/>
-      </w:pPr>
-      <w:r>
-        <w:rPr>
-          <w:rFonts w:ascii="Calibri" w:cs="Calibri" w:eastAsia="Calibri" w:hAnsi="Calibri"/>
-          <w:b/>
-          <w:bCs/>
-          <w:sz w:val="20"/>
-          <w:szCs w:val="20"/>
-        </w:rPr>
-        <w:t xml:space="preserve">14 days or less before the event: </w:t>
-      </w:r>
-      <w:r>
-        <w:rPr>
-          <w:rFonts w:ascii="Calibri" w:cs="Calibri" w:eastAsia="Calibri" w:hAnsi="Calibri"/>
-          <w:sz w:val="20"/>
-          <w:szCs w:val="20"/>
-        </w:rPr>
-        <w:t xml:space="preserve">the space rental is non-refundable.</w:t>
-      </w:r>
-    </w:p>
-    <w:p>
-      <w:pPr>
-        <w:pStyle w:val="ListParagraph"/>
-        <w:numPr>
-          <w:ilvl w:val="0"/>
-          <w:numId w:val="1"/>
-        </w:numPr>
-        <w:spacing w:after="80" w:line="264"/>
-      </w:pPr>
-      <w:r>
-        <w:rPr>
-          <w:rFonts w:ascii="Calibri" w:cs="Calibri" w:eastAsia="Calibri" w:hAnsi="Calibri"/>
-          <w:sz w:val="20"/>
-          <w:szCs w:val="20"/>
-        </w:rPr>
-        <w:t xml:space="preserve">The cleaning deposit is returned in every cancellation.</w:t>
-      </w:r>
-    </w:p>
-    <w:p>
-      <w:pPr>
-        <w:pStyle w:val="ListParagraph"/>
-        <w:numPr>
-          <w:ilvl w:val="0"/>
-          <w:numId w:val="1"/>
-        </w:numPr>
-        <w:spacing w:after="80" w:line="264"/>
-      </w:pPr>
-      <w:r>
-        <w:rPr>
-          <w:rFonts w:ascii="Calibri" w:cs="Calibri" w:eastAsia="Calibri" w:hAnsi="Calibri"/>
-          <w:sz w:val="20"/>
-          <w:szCs w:val="20"/>
-        </w:rPr>
-        <w:t xml:space="preserve">One reschedule to a mutually available date within 12 months is permitted at no charge if requested more than 15 days before the event.</w:t>
-      </w:r>
-    </w:p>
-    <w:p>
-      <w:pPr>
-        <w:pStyle w:val="ListParagraph"/>
-        <w:numPr>
-          <w:ilvl w:val="0"/>
-          <w:numId w:val="1"/>
-        </w:numPr>
-        <w:spacing w:after="80" w:line="264"/>
-      </w:pPr>
-      <w:r>
-        <w:rPr>
-          <w:rFonts w:ascii="Calibri" w:cs="Calibri" w:eastAsia="Calibri" w:hAnsi="Calibri"/>
-          <w:sz w:val="20"/>
-          <w:szCs w:val="20"/>
-        </w:rPr>
-        <w:t xml:space="preserve">If Owner cancels for any reason other than Renter’s breach, Renter receives a full refund of all amounts paid. That refund is Renter’s sole remedy.</w:t>
-      </w:r>
-    </w:p>
-    <w:p>
-      <w:pPr>
-        <w:spacing w:after="100" w:before="260"/>
-      </w:pPr>
-      <w:r>
-        <w:rPr>
-          <w:rFonts w:ascii="Calibri" w:cs="Calibri" w:eastAsia="Calibri" w:hAnsi="Calibri"/>
-          <w:b/>
-          <w:bCs/>
-          <w:caps/>
-          <w:color w:val="1B2A3D"/>
-          <w:spacing w:val="8"/>
-          <w:sz w:val="21"/>
-          <w:szCs w:val="21"/>
-        </w:rPr>
-        <w:t xml:space="preserve">8. Insurance</w:t>
-      </w:r>
-    </w:p>
-    <w:p>
-      <w:pPr>
-        <w:spacing w:after="120" w:before="0" w:line="264"/>
+        <w:t xml:space="preserve">of $500 is refundable. Owner returns it in full within 10 business days after the event if Renter leaves the Premises in the condition required by Section 9 and causes no damage.</w:t>
+      </w:r>
+    </w:p>
+    <w:p>
+      <w:pPr>
+        <w:spacing w:after="120" w:before="100" w:line="264"/>
         <w:jc w:val="left"/>
       </w:pPr>
       <w:r>
@@ -3933,7 +4044,7 @@
           <w:sz w:val="20"/>
           <w:szCs w:val="20"/>
         </w:rPr>
-        <w:t xml:space="preserve">At least 7 days before the event, Renter shall deliver to Owner a certificate of general liability insurance of not less than $1,000,000 per occurrence and $2,000,000 aggregate, naming 100 River Street Venture, LLC as an additional insured for the event date. If alcohol is served, the policy must include host liquor liability. Owner may cancel the event without refund if the certificate is not delivered on time.</w:t>
+        <w:t xml:space="preserve">Owner will charge against the security deposit, at actual cost, for (a) damage to the Premises, the building, or Owner’s property, and (b) any cleaning required beyond a broom-swept condition and typical post-event cleanup — for example spills or staining, adhesive or tape residue, food or beverage left behind, decorations not removed, waste Owner must haul, or restrooms left in unusual condition. Owner will return the unused balance with a written itemization. If those costs exceed $500, Renter pays the difference within 15 days of invoice.</w:t>
       </w:r>
     </w:p>
     <w:p>
@@ -3951,7 +4062,163 @@
           <w:sz w:val="21"/>
           <w:szCs w:val="21"/>
         </w:rPr>
-        <w:t xml:space="preserve">9. Condition of the premises</w:t>
+        <w:t xml:space="preserve">7. Cancellation and rescheduling</w:t>
+      </w:r>
+    </w:p>
+    <w:p>
+      <w:pPr>
+        <w:pStyle w:val="ListParagraph"/>
+        <w:numPr>
+          <w:ilvl w:val="0"/>
+          <w:numId w:val="1"/>
+        </w:numPr>
+        <w:spacing w:after="80" w:line="264"/>
+      </w:pPr>
+      <w:r>
+        <w:rPr>
+          <w:rFonts w:ascii="Calibri" w:cs="Calibri" w:eastAsia="Calibri" w:hAnsi="Calibri"/>
+          <w:b/>
+          <w:bCs/>
+          <w:sz w:val="20"/>
+          <w:szCs w:val="20"/>
+        </w:rPr>
+        <w:t xml:space="preserve">More than 30 days before the event: </w:t>
+      </w:r>
+      <w:r>
+        <w:rPr>
+          <w:rFonts w:ascii="Calibri" w:cs="Calibri" w:eastAsia="Calibri" w:hAnsi="Calibri"/>
+          <w:sz w:val="20"/>
+          <w:szCs w:val="20"/>
+        </w:rPr>
+        <w:t xml:space="preserve">full refund of amounts paid, less a $100 administrative fee.</w:t>
+      </w:r>
+    </w:p>
+    <w:p>
+      <w:pPr>
+        <w:pStyle w:val="ListParagraph"/>
+        <w:numPr>
+          <w:ilvl w:val="0"/>
+          <w:numId w:val="1"/>
+        </w:numPr>
+        <w:spacing w:after="80" w:line="264"/>
+      </w:pPr>
+      <w:r>
+        <w:rPr>
+          <w:rFonts w:ascii="Calibri" w:cs="Calibri" w:eastAsia="Calibri" w:hAnsi="Calibri"/>
+          <w:b/>
+          <w:bCs/>
+          <w:sz w:val="20"/>
+          <w:szCs w:val="20"/>
+        </w:rPr>
+        <w:t xml:space="preserve">15–30 days before the event: </w:t>
+      </w:r>
+      <w:r>
+        <w:rPr>
+          <w:rFonts w:ascii="Calibri" w:cs="Calibri" w:eastAsia="Calibri" w:hAnsi="Calibri"/>
+          <w:sz w:val="20"/>
+          <w:szCs w:val="20"/>
+        </w:rPr>
+        <w:t xml:space="preserve">Owner retains 50% of the space rental.</w:t>
+      </w:r>
+    </w:p>
+    <w:p>
+      <w:pPr>
+        <w:pStyle w:val="ListParagraph"/>
+        <w:numPr>
+          <w:ilvl w:val="0"/>
+          <w:numId w:val="1"/>
+        </w:numPr>
+        <w:spacing w:after="80" w:line="264"/>
+      </w:pPr>
+      <w:r>
+        <w:rPr>
+          <w:rFonts w:ascii="Calibri" w:cs="Calibri" w:eastAsia="Calibri" w:hAnsi="Calibri"/>
+          <w:b/>
+          <w:bCs/>
+          <w:sz w:val="20"/>
+          <w:szCs w:val="20"/>
+        </w:rPr>
+        <w:t xml:space="preserve">14 days or less before the event: </w:t>
+      </w:r>
+      <w:r>
+        <w:rPr>
+          <w:rFonts w:ascii="Calibri" w:cs="Calibri" w:eastAsia="Calibri" w:hAnsi="Calibri"/>
+          <w:sz w:val="20"/>
+          <w:szCs w:val="20"/>
+        </w:rPr>
+        <w:t xml:space="preserve">the space rental is non-refundable.</w:t>
+      </w:r>
+    </w:p>
+    <w:p>
+      <w:pPr>
+        <w:pStyle w:val="ListParagraph"/>
+        <w:numPr>
+          <w:ilvl w:val="0"/>
+          <w:numId w:val="1"/>
+        </w:numPr>
+        <w:spacing w:after="80" w:line="264"/>
+      </w:pPr>
+      <w:r>
+        <w:rPr>
+          <w:rFonts w:ascii="Calibri" w:cs="Calibri" w:eastAsia="Calibri" w:hAnsi="Calibri"/>
+          <w:sz w:val="20"/>
+          <w:szCs w:val="20"/>
+        </w:rPr>
+        <w:t xml:space="preserve">The cleaning fee and the security deposit are returned in full on any cancellation.</w:t>
+      </w:r>
+    </w:p>
+    <w:p>
+      <w:pPr>
+        <w:pStyle w:val="ListParagraph"/>
+        <w:numPr>
+          <w:ilvl w:val="0"/>
+          <w:numId w:val="1"/>
+        </w:numPr>
+        <w:spacing w:after="80" w:line="264"/>
+      </w:pPr>
+      <w:r>
+        <w:rPr>
+          <w:rFonts w:ascii="Calibri" w:cs="Calibri" w:eastAsia="Calibri" w:hAnsi="Calibri"/>
+          <w:sz w:val="20"/>
+          <w:szCs w:val="20"/>
+        </w:rPr>
+        <w:t xml:space="preserve">One reschedule to a mutually available date within 12 months is permitted at no charge if requested more than 15 days before the event.</w:t>
+      </w:r>
+    </w:p>
+    <w:p>
+      <w:pPr>
+        <w:pStyle w:val="ListParagraph"/>
+        <w:numPr>
+          <w:ilvl w:val="0"/>
+          <w:numId w:val="1"/>
+        </w:numPr>
+        <w:spacing w:after="80" w:line="264"/>
+      </w:pPr>
+      <w:r>
+        <w:rPr>
+          <w:rFonts w:ascii="Calibri" w:cs="Calibri" w:eastAsia="Calibri" w:hAnsi="Calibri"/>
+          <w:sz w:val="20"/>
+          <w:szCs w:val="20"/>
+        </w:rPr>
+        <w:t xml:space="preserve">If Owner cancels for any reason other than Renter’s breach, Renter receives a full refund of all amounts paid. That refund is Renter’s sole remedy.</w:t>
+      </w:r>
+    </w:p>
+    <w:p>
+      <w:pPr>
+        <w:spacing w:after="100" w:before="260"/>
+      </w:pPr>
+      <w:r>
+        <w:rPr>
+          <w:rFonts w:ascii="Calibri" w:cs="Calibri" w:eastAsia="Calibri" w:hAnsi="Calibri"/>
+          <w:b/>
+          <w:bCs/>
+          <w:caps/>
+          <w:color w:val="1B2A3D"/>
+          <w:spacing w:val="8"/>
+          <w:sz w:val="21"/>
+          <w:szCs w:val="21"/>
+        </w:rPr>
+        <w:t xml:space="preserve">8. Insurance</w:t>
       </w:r>
     </w:p>
     <w:p>
@@ -3971,6 +4238,44 @@
           <w:sz w:val="20"/>
           <w:szCs w:val="20"/>
         </w:rPr>
+        <w:t xml:space="preserve">At least 7 days before the event, Renter shall deliver to Owner a certificate of general liability insurance of not less than $1,000,000 per occurrence and $2,000,000 aggregate, naming 100 River Street Venture, LLC as an additional insured for the event date. If alcohol is served, the policy must include host liquor liability. Owner may cancel the event without refund if the certificate is not delivered on time.</w:t>
+      </w:r>
+    </w:p>
+    <w:p>
+      <w:pPr>
+        <w:spacing w:after="100" w:before="260"/>
+      </w:pPr>
+      <w:r>
+        <w:rPr>
+          <w:rFonts w:ascii="Calibri" w:cs="Calibri" w:eastAsia="Calibri" w:hAnsi="Calibri"/>
+          <w:b/>
+          <w:bCs/>
+          <w:caps/>
+          <w:color w:val="1B2A3D"/>
+          <w:spacing w:val="8"/>
+          <w:sz w:val="21"/>
+          <w:szCs w:val="21"/>
+        </w:rPr>
+        <w:t xml:space="preserve">9. Condition of the premises</w:t>
+      </w:r>
+    </w:p>
+    <w:p>
+      <w:pPr>
+        <w:spacing w:after="120" w:before="0" w:line="264"/>
+        <w:jc w:val="left"/>
+      </w:pPr>
+      <w:r>
+        <w:rPr>
+          <w:rFonts w:ascii="Calibri" w:cs="Calibri" w:eastAsia="Calibri" w:hAnsi="Calibri"/>
+          <w:b w:val="false"/>
+          <w:bCs w:val="false"/>
+          <w:i w:val="false"/>
+          <w:iCs w:val="false"/>
+          <w:caps w:val="false"/>
+          <w:color w:val="212529"/>
+          <w:sz w:val="20"/>
+          <w:szCs w:val="20"/>
+        </w:rPr>
         <w:t xml:space="preserve">At the end of the rental window Renter shall:</w:t>
       </w:r>
     </w:p>
@@ -4025,7 +4330,7 @@
           <w:sz w:val="20"/>
           <w:szCs w:val="20"/>
         </w:rPr>
-        <w:t xml:space="preserve">Sweep the floor and leave the Premises broom-clean.</w:t>
+        <w:t xml:space="preserve">Sweep the floor and leave the Premises in a broom-swept condition.</w:t>
       </w:r>
     </w:p>
     <w:p>

</xml_diff>